<commit_message>
Use past tense in resume experience
</commit_message>
<xml_diff>
--- a/assets/resume.docx
+++ b/assets/resume.docx
@@ -231,12 +231,10 @@
       </w:pPr>
       <w:r>
         <w:rPr>
+          <w:rFonts w:ascii="Arial" w:hAnsi="Arial"/>
           <w:rFonts w:ascii="Arial" w:hAnsi="Arial" w:eastAsia="Arial" w:cs="Arial"/>
-          <w:b w:val="0"/>
-          <w:color w:val="111827"/>
-          <w:sz w:val="17"/>
         </w:rPr>
-        <w:t>Веду аналитику внутреннего продукта с нуля: от бизнес-запроса до требований и приемки.</w:t>
+        <w:t>Вела аналитику внутреннего продукта с нуля: от бизнес-запроса до требований и приемки.</w:t>
       </w:r>
     </w:p>
     <w:p>
@@ -247,12 +245,10 @@
       </w:pPr>
       <w:r>
         <w:rPr>
+          <w:rFonts w:ascii="Arial" w:hAnsi="Arial"/>
           <w:rFonts w:ascii="Arial" w:hAnsi="Arial" w:eastAsia="Arial" w:cs="Arial"/>
-          <w:b w:val="0"/>
-          <w:color w:val="111827"/>
-          <w:sz w:val="17"/>
         </w:rPr>
-        <w:t>Пишу ТЗ и постановки для backend/frontend: логика, сценарии, валидации, статусы и ошибки.</w:t>
+        <w:t>Писала ТЗ и постановки для backend/frontend: логика, сценарии, валидации, статусы и ошибки.</w:t>
       </w:r>
     </w:p>
     <w:p>
@@ -263,12 +259,10 @@
       </w:pPr>
       <w:r>
         <w:rPr>
+          <w:rFonts w:ascii="Arial" w:hAnsi="Arial"/>
           <w:rFonts w:ascii="Arial" w:hAnsi="Arial" w:eastAsia="Arial" w:cs="Arial"/>
-          <w:b w:val="0"/>
-          <w:color w:val="111827"/>
-          <w:sz w:val="17"/>
         </w:rPr>
-        <w:t>Описываю REST-интеграции и data-flow: форматы данных, исключения, ретраи и правила обмена.</w:t>
+        <w:t>Описывала REST-интеграции и data-flow: форматы данных, исключения, ретраи и правила обмена.</w:t>
       </w:r>
     </w:p>
     <w:p>
@@ -279,12 +273,10 @@
       </w:pPr>
       <w:r>
         <w:rPr>
+          <w:rFonts w:ascii="Arial" w:hAnsi="Arial"/>
           <w:rFonts w:ascii="Arial" w:hAnsi="Arial" w:eastAsia="Arial" w:cs="Arial"/>
-          <w:b w:val="0"/>
-          <w:color w:val="111827"/>
-          <w:sz w:val="17"/>
         </w:rPr>
-        <w:t>Координирую delivery-часть: статусы задач, договоренности, блокеры, риски и вопросы к бизнесу.</w:t>
+        <w:t>Координировала delivery-часть: статусы задач, договоренности, блокеры, риски и вопросы к бизнесу.</w:t>
       </w:r>
     </w:p>
     <w:p>
@@ -295,12 +287,10 @@
       </w:pPr>
       <w:r>
         <w:rPr>
+          <w:rFonts w:ascii="Arial" w:hAnsi="Arial"/>
           <w:rFonts w:ascii="Arial" w:hAnsi="Arial" w:eastAsia="Arial" w:cs="Arial"/>
-          <w:b w:val="0"/>
-          <w:color w:val="111827"/>
-          <w:sz w:val="17"/>
         </w:rPr>
-        <w:t>Проверяю сценарии перед приемкой: SQL, Postman, сверка логики и кейсы для QA.</w:t>
+        <w:t>Проверяла сценарии перед приемкой: SQL, Postman, сверка логики и кейсы для QA.</w:t>
       </w:r>
     </w:p>
     <w:p>

</xml_diff>